<commit_message>
update docs on Thu, Sep 17, 2026  01:43:40 PM
</commit_message>
<xml_diff>
--- a/DSA/JavaStriverDSA/Arrays/StriverSDESheet_Arrays.docx
+++ b/DSA/JavaStriverDSA/Arrays/StriverSDESheet_Arrays.docx
@@ -21394,7 +21394,19 @@
         <w:rPr>
           <w:lang w:val="en-IN"/>
         </w:rPr>
-        <w:t>HashSet where we are storing our elements.</w:t>
+        <w:t>Hash</w:t>
+      </w:r>
+      <w:r>
+        <w:rPr>
+          <w:lang w:val="en-IN"/>
+        </w:rPr>
+        <w:t>Map</w:t>
+      </w:r>
+      <w:r>
+        <w:rPr>
+          <w:lang w:val="en-IN"/>
+        </w:rPr>
+        <w:t xml:space="preserve"> where we are storing our elements.</w:t>
       </w:r>
     </w:p>
     <w:p>

</xml_diff>